<commit_message>
Add listening win + blasting vendor progress
</commit_message>
<xml_diff>
--- a/Weekly_Recap_Week1.docx
+++ b/Weekly_Recap_Week1.docx
@@ -356,6 +356,51 @@
           <w:sz w:val="20"/>
         </w:rPr>
         <w:t>Bryan (maintenance) wants to audit the current belt cleaning operation - opening for a dry ice blasting trial and cost comparison.</w:t>
+      </w:r>
+    </w:p>
+    <w:p>
+      <w:pPr>
+        <w:pStyle w:val="ListBullet"/>
+        <w:spacing w:before="0" w:after="20"/>
+        <w:ind w:left="360"/>
+      </w:pPr>
+      <w:r>
+        <w:rPr>
+          <w:sz w:val="20"/>
+        </w:rPr>
+        <w:t xml:space="preserve">Maintenance tech stopped me after a conversation to say </w:t>
+      </w:r>
+      <w:r>
+        <w:rPr>
+          <w:b/>
+          <w:sz w:val="20"/>
+        </w:rPr>
+        <w:t>"thanks for listening."</w:t>
+      </w:r>
+      <w:r>
+        <w:rPr>
+          <w:sz w:val="20"/>
+        </w:rPr>
+        <w:t xml:space="preserve"> That's the first real trust deposit from the floor - and proof the approach is working.</w:t>
+      </w:r>
+    </w:p>
+    <w:p>
+      <w:pPr>
+        <w:pStyle w:val="ListBullet"/>
+        <w:spacing w:before="0" w:after="20"/>
+        <w:ind w:left="360"/>
+      </w:pPr>
+      <w:r>
+        <w:rPr>
+          <w:sz w:val="20"/>
+        </w:rPr>
+        <w:t xml:space="preserve">Belt cleaning alternative: </w:t>
+      </w:r>
+      <w:r>
+        <w:rPr>
+          <w:sz w:val="20"/>
+        </w:rPr>
+        <w:t>Contacted a vendor who is willing to come on site, review operations, and quote a dry ice blasting trial. Concept to real next step in one day.</w:t>
       </w:r>
     </w:p>
     <w:p>

</xml_diff>

<commit_message>
Add systems-in-motion tracker to recap
</commit_message>
<xml_diff>
--- a/Weekly_Recap_Week1.docx
+++ b/Weekly_Recap_Week1.docx
@@ -815,6 +815,379 @@
     </w:p>
     <w:p/>
     <w:p>
+      <w:pPr>
+        <w:spacing w:before="200" w:after="60"/>
+        <w:pBdr>
+          <w:bottom w:val="single" w:sz="6" w:space="1" w:color="f59e0b"/>
+        </w:pBdr>
+      </w:pPr>
+      <w:r>
+        <w:rPr>
+          <w:b/>
+          <w:color w:val="1E293B"/>
+          <w:sz w:val="24"/>
+        </w:rPr>
+        <w:t>WHAT WE'RE BUILDING — SYSTEMS IN MOTION</w:t>
+      </w:r>
+    </w:p>
+    <w:p>
+      <w:r>
+        <w:rPr>
+          <w:i/>
+          <w:color w:val="64748B"/>
+          <w:sz w:val="18"/>
+        </w:rPr>
+        <w:t>These are the durable systems that outlast day-to-day firefighting. This is the foundation that runs without you.</w:t>
+      </w:r>
+    </w:p>
+    <w:p>
+      <w:pPr>
+        <w:pStyle w:val="ListBullet"/>
+        <w:spacing w:before="0" w:after="40"/>
+        <w:ind w:left="360"/>
+      </w:pPr>
+      <w:r>
+        <w:rPr>
+          <w:b/>
+          <w:color w:val="F59E0B"/>
+          <w:sz w:val="18"/>
+        </w:rPr>
+        <w:t xml:space="preserve">[BUILDING] </w:t>
+      </w:r>
+      <w:r>
+        <w:rPr>
+          <w:b/>
+          <w:sz w:val="20"/>
+        </w:rPr>
+        <w:t>Vest-until-verified program</w:t>
+      </w:r>
+      <w:r>
+        <w:rPr>
+          <w:sz w:val="20"/>
+        </w:rPr>
+        <w:t xml:space="preserve"> — Greg approved, Matt enthusiastic, pilot pending.</w:t>
+      </w:r>
+    </w:p>
+    <w:p>
+      <w:pPr>
+        <w:pStyle w:val="ListBullet"/>
+        <w:spacing w:before="0" w:after="40"/>
+        <w:ind w:left="360"/>
+      </w:pPr>
+      <w:r>
+        <w:rPr>
+          <w:b/>
+          <w:color w:val="059669"/>
+          <w:sz w:val="18"/>
+        </w:rPr>
+        <w:t xml:space="preserve">[DONE] </w:t>
+      </w:r>
+      <w:r>
+        <w:rPr>
+          <w:b/>
+          <w:sz w:val="20"/>
+        </w:rPr>
+        <w:t>New Hire Orientation Checklist</w:t>
+      </w:r>
+      <w:r>
+        <w:rPr>
+          <w:sz w:val="20"/>
+        </w:rPr>
+        <w:t xml:space="preserve"> — 3-phase, competency-gated, branded. Rollout with your Monday orientation.</w:t>
+      </w:r>
+    </w:p>
+    <w:p>
+      <w:pPr>
+        <w:pStyle w:val="ListBullet"/>
+        <w:spacing w:before="0" w:after="40"/>
+        <w:ind w:left="360"/>
+      </w:pPr>
+      <w:r>
+        <w:rPr>
+          <w:b/>
+          <w:color w:val="F59E0B"/>
+          <w:sz w:val="18"/>
+        </w:rPr>
+        <w:t xml:space="preserve">[BUILDING] </w:t>
+      </w:r>
+      <w:r>
+        <w:rPr>
+          <w:b/>
+          <w:sz w:val="20"/>
+        </w:rPr>
+        <w:t>Corrective Action Tracker</w:t>
+      </w:r>
+      <w:r>
+        <w:rPr>
+          <w:sz w:val="20"/>
+        </w:rPr>
+        <w:t xml:space="preserve"> — status dropdown, color coding, days-open. Needs real items filled.</w:t>
+      </w:r>
+    </w:p>
+    <w:p>
+      <w:pPr>
+        <w:pStyle w:val="ListBullet"/>
+        <w:spacing w:before="0" w:after="40"/>
+        <w:ind w:left="360"/>
+      </w:pPr>
+      <w:r>
+        <w:rPr>
+          <w:b/>
+          <w:color w:val="059669"/>
+          <w:sz w:val="18"/>
+        </w:rPr>
+        <w:t xml:space="preserve">[DONE] </w:t>
+      </w:r>
+      <w:r>
+        <w:rPr>
+          <w:b/>
+          <w:sz w:val="20"/>
+        </w:rPr>
+        <w:t>2026 Safety Alert spreadsheet</w:t>
+      </w:r>
+      <w:r>
+        <w:rPr>
+          <w:sz w:val="20"/>
+        </w:rPr>
+        <w:t xml:space="preserve"> — cleaned, branded, auto-filters + dashboard tab.</w:t>
+      </w:r>
+    </w:p>
+    <w:p>
+      <w:pPr>
+        <w:pStyle w:val="ListBullet"/>
+        <w:spacing w:before="0" w:after="40"/>
+        <w:ind w:left="360"/>
+      </w:pPr>
+      <w:r>
+        <w:rPr>
+          <w:b/>
+          <w:color w:val="059669"/>
+          <w:sz w:val="18"/>
+        </w:rPr>
+        <w:t xml:space="preserve">[LIVE] </w:t>
+      </w:r>
+      <w:r>
+        <w:rPr>
+          <w:b/>
+          <w:sz w:val="20"/>
+        </w:rPr>
+        <w:t>Wall dashboard frame</w:t>
+      </w:r>
+      <w:r>
+        <w:rPr>
+          <w:sz w:val="20"/>
+        </w:rPr>
+        <w:t xml:space="preserve"> — priorities, calendar, roadmap, quote, action board. Your daily anchor.</w:t>
+      </w:r>
+    </w:p>
+    <w:p>
+      <w:pPr>
+        <w:pStyle w:val="ListBullet"/>
+        <w:spacing w:before="0" w:after="40"/>
+        <w:ind w:left="360"/>
+      </w:pPr>
+      <w:r>
+        <w:rPr>
+          <w:b/>
+          <w:color w:val="F59E0B"/>
+          <w:sz w:val="18"/>
+        </w:rPr>
+        <w:t xml:space="preserve">[BUILDING] </w:t>
+      </w:r>
+      <w:r>
+        <w:rPr>
+          <w:b/>
+          <w:sz w:val="20"/>
+        </w:rPr>
+        <w:t>Board dashboard (superior-ehs-dashboard)</w:t>
+      </w:r>
+      <w:r>
+        <w:rPr>
+          <w:sz w:val="20"/>
+        </w:rPr>
+        <w:t xml:space="preserve"> — KPI, chart, tenure/body-part breakdowns.</w:t>
+      </w:r>
+    </w:p>
+    <w:p>
+      <w:pPr>
+        <w:pStyle w:val="ListBullet"/>
+        <w:spacing w:before="0" w:after="40"/>
+        <w:ind w:left="360"/>
+      </w:pPr>
+      <w:r>
+        <w:rPr>
+          <w:b/>
+          <w:color w:val="F59E0B"/>
+          <w:sz w:val="18"/>
+        </w:rPr>
+        <w:t xml:space="preserve">[BUILDING] </w:t>
+      </w:r>
+      <w:r>
+        <w:rPr>
+          <w:b/>
+          <w:sz w:val="20"/>
+        </w:rPr>
+        <w:t>KSS Partnership</w:t>
+      </w:r>
+      <w:r>
+        <w:rPr>
+          <w:sz w:val="20"/>
+        </w:rPr>
+        <w:t xml:space="preserve"> — one-pager done; call Mon Nov 2. Turning agencies into safety allies.</w:t>
+      </w:r>
+    </w:p>
+    <w:p>
+      <w:pPr>
+        <w:pStyle w:val="ListBullet"/>
+        <w:spacing w:before="0" w:after="40"/>
+        <w:ind w:left="360"/>
+      </w:pPr>
+      <w:r>
+        <w:rPr>
+          <w:b/>
+          <w:color w:val="F59E0B"/>
+          <w:sz w:val="18"/>
+        </w:rPr>
+        <w:t xml:space="preserve">[BUILDING] </w:t>
+      </w:r>
+      <w:r>
+        <w:rPr>
+          <w:b/>
+          <w:sz w:val="20"/>
+        </w:rPr>
+        <w:t>Belt cleaning cost analysis</w:t>
+      </w:r>
+      <w:r>
+        <w:rPr>
+          <w:sz w:val="20"/>
+        </w:rPr>
+        <w:t xml:space="preserve"> — current vs. dry ice blasting template done; needs real numbers.</w:t>
+      </w:r>
+    </w:p>
+    <w:p>
+      <w:pPr>
+        <w:pStyle w:val="ListBullet"/>
+        <w:spacing w:before="0" w:after="40"/>
+        <w:ind w:left="360"/>
+      </w:pPr>
+      <w:r>
+        <w:rPr>
+          <w:b/>
+          <w:color w:val="64748B"/>
+          <w:sz w:val="18"/>
+        </w:rPr>
+        <w:t xml:space="preserve">[IDEA] </w:t>
+      </w:r>
+      <w:r>
+        <w:rPr>
+          <w:b/>
+          <w:sz w:val="20"/>
+        </w:rPr>
+        <w:t>Anonymous employee pulse survey</w:t>
+      </w:r>
+      <w:r>
+        <w:rPr>
+          <w:sz w:val="20"/>
+        </w:rPr>
+        <w:t xml:space="preserve"> — concept. Trust-building workaround. Needs Greg green light.</w:t>
+      </w:r>
+    </w:p>
+    <w:p>
+      <w:pPr>
+        <w:pStyle w:val="ListBullet"/>
+        <w:spacing w:before="0" w:after="40"/>
+        <w:ind w:left="360"/>
+      </w:pPr>
+      <w:r>
+        <w:rPr>
+          <w:b/>
+          <w:color w:val="64748B"/>
+          <w:sz w:val="18"/>
+        </w:rPr>
+        <w:t xml:space="preserve">[IDEA] </w:t>
+      </w:r>
+      <w:r>
+        <w:rPr>
+          <w:b/>
+          <w:sz w:val="20"/>
+        </w:rPr>
+        <w:t>Hydration stations</w:t>
+      </w:r>
+      <w:r>
+        <w:rPr>
+          <w:sz w:val="20"/>
+        </w:rPr>
+        <w:t xml:space="preserve"> — cheap visible win. Not started.</w:t>
+      </w:r>
+    </w:p>
+    <w:p>
+      <w:pPr>
+        <w:pStyle w:val="ListBullet"/>
+        <w:spacing w:before="0" w:after="40"/>
+        <w:ind w:left="360"/>
+      </w:pPr>
+      <w:r>
+        <w:rPr>
+          <w:b/>
+          <w:color w:val="64748B"/>
+          <w:sz w:val="18"/>
+        </w:rPr>
+        <w:t xml:space="preserve">[IDEA] </w:t>
+      </w:r>
+      <w:r>
+        <w:rPr>
+          <w:b/>
+          <w:sz w:val="20"/>
+        </w:rPr>
+        <w:t>Saw + vacuum for insulation cutting</w:t>
+      </w:r>
+      <w:r>
+        <w:rPr>
+          <w:sz w:val="20"/>
+        </w:rPr>
+        <w:t xml:space="preserve"> — furnace builder's fix. Needs quote.</w:t>
+      </w:r>
+    </w:p>
+    <w:p>
+      <w:pPr>
+        <w:pStyle w:val="ListBullet"/>
+        <w:spacing w:before="0" w:after="40"/>
+        <w:ind w:left="360"/>
+      </w:pPr>
+      <w:r>
+        <w:rPr>
+          <w:b/>
+          <w:color w:val="059669"/>
+          <w:sz w:val="18"/>
+        </w:rPr>
+        <w:t xml:space="preserve">[DONE] </w:t>
+      </w:r>
+      <w:r>
+        <w:rPr>
+          <w:b/>
+          <w:sz w:val="20"/>
+        </w:rPr>
+        <w:t>Incident pattern analysis</w:t>
+      </w:r>
+      <w:r>
+        <w:rPr>
+          <w:sz w:val="20"/>
+        </w:rPr>
+        <w:t xml:space="preserve"> — temp vs direct, tenure, hand injuries. Drives everything we build.</w:t>
+      </w:r>
+    </w:p>
+    <w:p>
+      <w:r>
+        <w:rPr>
+          <w:b/>
+          <w:i/>
+          <w:color w:val="DC2626"/>
+          <w:sz w:val="18"/>
+        </w:rPr>
+        <w:t>Rule: every week, the [IDEA] list should shrink and the [LIVE]/[DONE] list should grow. If ideas aren't becoming live systems, you're not building.</w:t>
+      </w:r>
+    </w:p>
+    <w:p>
       <w:r>
         <w:rPr>
           <w:i/>

</xml_diff>